<commit_message>
Updated the Report Generation elaboration document (typos)
</commit_message>
<xml_diff>
--- a/source/reference_documents/elaboration_documents/Report Generation/Report Generation.docx
+++ b/source/reference_documents/elaboration_documents/Report Generation/Report Generation.docx
@@ -28,7 +28,7 @@
         <w:t xml:space="preserve">Version </w:t>
       </w:r>
       <w:r>
-        <w:t>2</w:t>
+        <w:t>3</w:t>
       </w:r>
     </w:p>
     <w:p>
@@ -45,7 +45,7 @@
         <w:rPr>
           <w:noProof/>
         </w:rPr>
-        <w:t>2/23/26 7:30 AM</w:t>
+        <w:t>2/23/26 11:57 AM</w:t>
       </w:r>
       <w:r>
         <w:fldChar w:fldCharType="end"/>
@@ -268,7 +268,13 @@
         <w:pStyle w:val="FirstParagraph"/>
       </w:pPr>
       <w:r>
-        <w:t>Within the AVCDL many processes have activities which generate reports intended to be used a documents of record stored in the DMS</w:t>
+        <w:t>Within the AVCDL many processes have activities which generate reports intended to be used a</w:t>
+      </w:r>
+      <w:r>
+        <w:t>s</w:t>
+      </w:r>
+      <w:r>
+        <w:t xml:space="preserve"> documents of record stored in the DMS</w:t>
       </w:r>
       <w:r>
         <w:t xml:space="preserve">. </w:t>
@@ -316,13 +322,7 @@
         <w:pStyle w:val="FirstParagraph"/>
       </w:pPr>
       <w:r>
-        <w:t>Within the context of this document, when a URI is specified the expectation is that it provide an identifier capable of locating the resource in both space and time</w:t>
-      </w:r>
-      <w:r>
-        <w:t>.</w:t>
-      </w:r>
-      <w:r>
-        <w:t xml:space="preserve"> This is to say that there should be no ambiguity as to which of a possible number of revisions of the resource is being referenced.</w:t>
+        <w:t>Within the context of this document, when a URI is specified the expectation is that it provide an identifier capable of locating the resource in both space and time. This is to say that there should be no ambiguity as to which of a possible number of revisions of the resource is being referenced.</w:t>
       </w:r>
     </w:p>
     <w:p>
@@ -971,12 +971,7 @@
       </w:r>
       <w:r>
         <w:tab/>
-      </w:r>
-      <w:r>
-        <w:t>When the activity does not involve software tooling, this should be noted</w:t>
-      </w:r>
-      <w:r>
-        <w:t>.</w:t>
+        <w:t>When the activity does not involve software tooling, this should be noted.</w:t>
       </w:r>
     </w:p>
     <w:p>
@@ -1432,12 +1427,7 @@
       </w:r>
       <w:r>
         <w:tab/>
-      </w:r>
-      <w:r>
-        <w:t>Diagrams should be included when appropriate</w:t>
-      </w:r>
-      <w:r>
-        <w:t>.</w:t>
+        <w:t>Diagrams should be included when appropriate.</w:t>
       </w:r>
     </w:p>
     <w:p>
@@ -1971,7 +1961,7 @@
         <w:t>T</w:t>
       </w:r>
       <w:r>
-        <w:t xml:space="preserve">here are two variants of the generated report. The first is simply enumerates the results. The second groups the results by disposition and severity. The second case is used </w:t>
+        <w:t xml:space="preserve">here are two variants of the generated report. The first simply enumerates the results. The second groups the results by disposition and severity. The second case is used </w:t>
       </w:r>
       <w:r>
         <w:t>for</w:t>
@@ -2043,12 +2033,7 @@
       </w:r>
       <w:r>
         <w:tab/>
-      </w:r>
-      <w:r>
-        <w:t>Python libraries are available for ingesting JSON-encoded SARIF and also generating PDFs</w:t>
-      </w:r>
-      <w:r>
-        <w:t>.</w:t>
+        <w:t>Python libraries are available for ingesting JSON-encoded SARIF and also generating PDFs.</w:t>
       </w:r>
     </w:p>
     <w:p>
@@ -2174,12 +2159,7 @@
       </w:r>
       <w:r>
         <w:tab/>
-      </w:r>
-      <w:r>
-        <w:t>The specific composition of the report preamble section is established by the organization</w:t>
-      </w:r>
-      <w:r>
-        <w:t>.</w:t>
+        <w:t>The specific composition of the report preamble section is established by the organization.</w:t>
       </w:r>
     </w:p>
     <w:p>
@@ -2201,7 +2181,13 @@
         <w:t>W</w:t>
       </w:r>
       <w:r>
-        <w:t>hen organizing the results that</w:t>
+        <w:t xml:space="preserve">hen organizing the results </w:t>
+      </w:r>
+      <w:r>
+        <w:t xml:space="preserve">ensure </w:t>
+      </w:r>
+      <w:r>
+        <w:t>that</w:t>
       </w:r>
       <w:r>
         <w:t xml:space="preserve"> clear section headings be used</w:t>

</xml_diff>